<commit_message>
Finalize master AI Dungeon parameters specification (merged full design) and prompts as per final design
</commit_message>
<xml_diff>
--- a/design_docs/hades_enemies.docx
+++ b/design_docs/hades_enemies.docx
@@ -4,7 +4,15 @@
   <w:body>
     <w:p>
       <w:r>
-        <w:t>Hades enemies details</w:t>
+        <w:t xml:space="preserve">Hades </w:t>
+      </w:r>
+      <w:proofErr w:type="gramStart"/>
+      <w:r>
+        <w:t>enemies</w:t>
+      </w:r>
+      <w:proofErr w:type="gramEnd"/>
+      <w:r>
+        <w:t xml:space="preserve"> details</w:t>
       </w:r>
     </w:p>
     <w:p>
@@ -1430,13 +1438,21 @@
     </w:p>
     <w:p>
       <w:r>
-        <w:t>Purpose: Limits safe zones.</w:t>
+        <w:t xml:space="preserve">Purpose: </w:t>
+      </w:r>
+      <w:proofErr w:type="gramStart"/>
+      <w:r>
+        <w:t>Limits</w:t>
+      </w:r>
+      <w:proofErr w:type="gramEnd"/>
+      <w:r>
+        <w:t xml:space="preserve"> safe zones.</w:t>
       </w:r>
     </w:p>
     <w:p>
       <w:r>
         <w:pict w14:anchorId="18563DE6">
-          <v:rect id="_x0000_i1050" style="width:0;height:1.5pt" o:hralign="center" o:hrstd="t" o:hr="t" fillcolor="#a0a0a0" stroked="f"/>
+          <v:rect id="_x0000_i1025" style="width:0;height:1.5pt" o:hralign="center" o:hrstd="t" o:hr="t" fillcolor="#a0a0a0" stroked="f"/>
         </w:pict>
       </w:r>
     </w:p>
@@ -1671,7 +1687,7 @@
     <w:p>
       <w:r>
         <w:pict w14:anchorId="526C8610">
-          <v:rect id="_x0000_i1070" style="width:0;height:1.5pt" o:hralign="center" o:hrstd="t" o:hr="t" fillcolor="#a0a0a0" stroked="f"/>
+          <v:rect id="_x0000_i1026" style="width:0;height:1.5pt" o:hralign="center" o:hrstd="t" o:hr="t" fillcolor="#a0a0a0" stroked="f"/>
         </w:pict>
       </w:r>
     </w:p>
@@ -1803,31 +1819,17 @@
       </w:r>
     </w:p>
     <w:p>
-      <w:pPr>
-        <w:numPr>
-          <w:ilvl w:val="0"/>
-          <w:numId w:val="25"/>
-        </w:numPr>
-      </w:pPr>
-      <w:r>
-        <w:t>Each elite can summon once</w:t>
-      </w:r>
-    </w:p>
-    <w:p>
-      <w:pPr>
-        <w:numPr>
-          <w:ilvl w:val="0"/>
-          <w:numId w:val="25"/>
-        </w:numPr>
-      </w:pPr>
-      <w:r>
-        <w:t>Global elite summon cap: 3 per run</w:t>
-      </w:r>
-    </w:p>
-    <w:p>
+      <w:r>
+        <w:t>Each elite enemy may summon once per encounter.</w:t>
+      </w:r>
+    </w:p>
+    <w:p>
+      <w:r>
+        <w:t>Total elite summons across the entire run must not exceed 3.</w:t>
+      </w:r>
       <w:r>
         <w:pict w14:anchorId="285FFBF7">
-          <v:rect id="_x0000_i1071" style="width:0;height:1.5pt" o:hralign="center" o:hrstd="t" o:hr="t" fillcolor="#a0a0a0" stroked="f"/>
+          <v:rect id="_x0000_i1027" style="width:0;height:1.5pt" o:hralign="center" o:hrstd="t" o:hr="t" fillcolor="#a0a0a0" stroked="f"/>
         </w:pict>
       </w:r>
     </w:p>
@@ -1952,7 +1954,7 @@
     <w:p>
       <w:r>
         <w:pict w14:anchorId="0551F8A4">
-          <v:rect id="_x0000_i1072" style="width:0;height:1.5pt" o:hralign="center" o:hrstd="t" o:hr="t" fillcolor="#a0a0a0" stroked="f"/>
+          <v:rect id="_x0000_i1028" style="width:0;height:1.5pt" o:hralign="center" o:hrstd="t" o:hr="t" fillcolor="#a0a0a0" stroked="f"/>
         </w:pict>
       </w:r>
     </w:p>
@@ -2071,7 +2073,103 @@
           <w:b/>
           <w:bCs/>
         </w:rPr>
-        <w:t>Questions: What can be the player characteristics like closer shot with sword, longer projectile shot? We can define starting parameters these number of close or projectile shots required to destroy this kind of enemy? Once’s done we can generate prompts. We can fine tune the parameters later on. I believe without defining by ourselves, Cursor AI can assume some of them itself and might be difficult to debug?</w:t>
+        <w:t xml:space="preserve">Questions: What </w:t>
+      </w:r>
+      <w:proofErr w:type="gramStart"/>
+      <w:r>
+        <w:rPr>
+          <w:b/>
+          <w:bCs/>
+        </w:rPr>
+        <w:t>can be</w:t>
+      </w:r>
+      <w:proofErr w:type="gramEnd"/>
+      <w:r>
+        <w:rPr>
+          <w:b/>
+          <w:bCs/>
+        </w:rPr>
+        <w:t xml:space="preserve"> the player characteristics like closer shot with sword, longer projectile shot? </w:t>
+      </w:r>
+      <w:proofErr w:type="gramStart"/>
+      <w:r>
+        <w:rPr>
+          <w:b/>
+          <w:bCs/>
+        </w:rPr>
+        <w:t>We can</w:t>
+      </w:r>
+      <w:proofErr w:type="gramEnd"/>
+      <w:r>
+        <w:rPr>
+          <w:b/>
+          <w:bCs/>
+        </w:rPr>
+        <w:t xml:space="preserve"> define starting parameters </w:t>
+      </w:r>
+      <w:proofErr w:type="gramStart"/>
+      <w:r>
+        <w:rPr>
+          <w:b/>
+          <w:bCs/>
+        </w:rPr>
+        <w:t>these number</w:t>
+      </w:r>
+      <w:proofErr w:type="gramEnd"/>
+      <w:r>
+        <w:rPr>
+          <w:b/>
+          <w:bCs/>
+        </w:rPr>
+        <w:t xml:space="preserve"> of close or projectile shots required to destroy this kind of </w:t>
+      </w:r>
+      <w:proofErr w:type="gramStart"/>
+      <w:r>
+        <w:rPr>
+          <w:b/>
+          <w:bCs/>
+        </w:rPr>
+        <w:t>enemy?</w:t>
+      </w:r>
+      <w:proofErr w:type="gramEnd"/>
+      <w:r>
+        <w:rPr>
+          <w:b/>
+          <w:bCs/>
+        </w:rPr>
+        <w:t xml:space="preserve"> </w:t>
+      </w:r>
+      <w:proofErr w:type="gramStart"/>
+      <w:r>
+        <w:rPr>
+          <w:b/>
+          <w:bCs/>
+        </w:rPr>
+        <w:t>Once’s</w:t>
+      </w:r>
+      <w:proofErr w:type="gramEnd"/>
+      <w:r>
+        <w:rPr>
+          <w:b/>
+          <w:bCs/>
+        </w:rPr>
+        <w:t xml:space="preserve"> done we can generate prompts. We can fine tune the parameters </w:t>
+      </w:r>
+      <w:proofErr w:type="gramStart"/>
+      <w:r>
+        <w:rPr>
+          <w:b/>
+          <w:bCs/>
+        </w:rPr>
+        <w:t>later on</w:t>
+      </w:r>
+      <w:proofErr w:type="gramEnd"/>
+      <w:r>
+        <w:rPr>
+          <w:b/>
+          <w:bCs/>
+        </w:rPr>
+        <w:t>. I believe without defining by ourselves, Cursor AI can assume some of them itself and might be difficult to debug?</w:t>
       </w:r>
     </w:p>
     <w:p/>
@@ -7254,6 +7352,7 @@
   <w:style w:type="character" w:default="1" w:styleId="DefaultParagraphFont">
     <w:name w:val="Default Paragraph Font"/>
     <w:uiPriority w:val="1"/>
+    <w:semiHidden/>
     <w:unhideWhenUsed/>
   </w:style>
   <w:style w:type="table" w:default="1" w:styleId="TableNormal">

</xml_diff>